<commit_message>
Se agrego la tabla de aspirantes al documento de estructuras
Se actualizo el documento Estructura_y_Tipos de Datos_SII para que contenga tambien la estructura de la tabla de los aspirantes
</commit_message>
<xml_diff>
--- a/Documentacion/Estructura_y_Tipos de Datos_SII_ChavezLizarraga.docx
+++ b/Documentacion/Estructura_y_Tipos de Datos_SII_ChavezLizarraga.docx
@@ -69,27 +69,7 @@
           <w:sz w:val="28"/>
           <w:szCs w:val="28"/>
         </w:rPr>
-        <w:t xml:space="preserve">1. Tabla: </w:t>
-      </w:r>
-      <w:r>
-        <w:rPr>
-          <w:rFonts w:ascii="Arial" w:hAnsi="Arial" w:cs="Arial"/>
-          <w:b/>
-          <w:bCs/>
-          <w:sz w:val="28"/>
-          <w:szCs w:val="28"/>
-        </w:rPr>
-        <w:t>E</w:t>
-      </w:r>
-      <w:r>
-        <w:rPr>
-          <w:rFonts w:ascii="Arial" w:hAnsi="Arial" w:cs="Arial"/>
-          <w:b/>
-          <w:bCs/>
-          <w:sz w:val="28"/>
-          <w:szCs w:val="28"/>
-        </w:rPr>
-        <w:t>studiantes</w:t>
+        <w:t>1. Tabla: Estudiantes</w:t>
       </w:r>
     </w:p>
     <w:p>
@@ -1915,27 +1895,7 @@
           <w:sz w:val="28"/>
           <w:szCs w:val="28"/>
         </w:rPr>
-        <w:t xml:space="preserve">2. Tabla: </w:t>
-      </w:r>
-      <w:r>
-        <w:rPr>
-          <w:rFonts w:ascii="Arial" w:hAnsi="Arial" w:cs="Arial"/>
-          <w:b/>
-          <w:bCs/>
-          <w:sz w:val="28"/>
-          <w:szCs w:val="28"/>
-        </w:rPr>
-        <w:t>P</w:t>
-      </w:r>
-      <w:r>
-        <w:rPr>
-          <w:rFonts w:ascii="Arial" w:hAnsi="Arial" w:cs="Arial"/>
-          <w:b/>
-          <w:bCs/>
-          <w:sz w:val="28"/>
-          <w:szCs w:val="28"/>
-        </w:rPr>
-        <w:t>rofesores</w:t>
+        <w:t>2. Tabla: Profesores</w:t>
       </w:r>
     </w:p>
     <w:p>
@@ -6521,6 +6481,888 @@
       <w:pPr>
         <w:spacing w:line="276" w:lineRule="auto"/>
       </w:pPr>
+    </w:p>
+    <w:p>
+      <w:pPr>
+        <w:spacing w:line="276" w:lineRule="auto"/>
+      </w:pPr>
+    </w:p>
+    <w:p>
+      <w:pPr>
+        <w:spacing w:line="276" w:lineRule="auto"/>
+      </w:pPr>
+    </w:p>
+    <w:p>
+      <w:pPr>
+        <w:spacing w:line="276" w:lineRule="auto"/>
+      </w:pPr>
+    </w:p>
+    <w:p>
+      <w:pPr>
+        <w:spacing w:line="276" w:lineRule="auto"/>
+      </w:pPr>
+    </w:p>
+    <w:p>
+      <w:pPr>
+        <w:spacing w:line="276" w:lineRule="auto"/>
+      </w:pPr>
+    </w:p>
+    <w:p>
+      <w:pPr>
+        <w:spacing w:line="276" w:lineRule="auto"/>
+      </w:pPr>
+    </w:p>
+    <w:p>
+      <w:pPr>
+        <w:spacing w:line="276" w:lineRule="auto"/>
+      </w:pPr>
+    </w:p>
+    <w:p>
+      <w:pPr>
+        <w:spacing w:line="276" w:lineRule="auto"/>
+        <w:jc w:val="center"/>
+        <w:rPr>
+          <w:rFonts w:ascii="Arial" w:hAnsi="Arial" w:cs="Arial"/>
+          <w:sz w:val="32"/>
+          <w:szCs w:val="32"/>
+        </w:rPr>
+      </w:pPr>
+      <w:r>
+        <w:rPr>
+          <w:rFonts w:ascii="Arial" w:hAnsi="Arial" w:cs="Arial"/>
+          <w:b/>
+          <w:bCs/>
+          <w:sz w:val="32"/>
+          <w:szCs w:val="32"/>
+        </w:rPr>
+        <w:lastRenderedPageBreak/>
+        <w:t>6. Tabla: aspirantes</w:t>
+      </w:r>
+    </w:p>
+    <w:p>
+      <w:pPr>
+        <w:spacing w:line="360" w:lineRule="auto"/>
+        <w:jc w:val="both"/>
+        <w:rPr>
+          <w:rFonts w:ascii="Arial" w:hAnsi="Arial" w:cs="Arial"/>
+        </w:rPr>
+      </w:pPr>
+      <w:r>
+        <w:rPr>
+          <w:rFonts w:ascii="Arial" w:hAnsi="Arial" w:cs="Arial"/>
+        </w:rPr>
+        <w:t>Almacena la información de los candidatos que se encuentran en el proceso de admisión para ingresar a la institución. Esta tabla es temporal/transitoria, ya que, si el aspirante es aceptado, sus datos principales migrarán a la tabla de estudiantes.</w:t>
+      </w:r>
+    </w:p>
+    <w:tbl>
+      <w:tblPr>
+        <w:tblStyle w:val="Tablaconcuadrcula"/>
+        <w:tblW w:w="0" w:type="auto"/>
+        <w:jc w:val="center"/>
+        <w:tblLook w:val="04A0" w:firstRow="1" w:lastRow="0" w:firstColumn="1" w:lastColumn="0" w:noHBand="0" w:noVBand="1"/>
+      </w:tblPr>
+      <w:tblGrid>
+        <w:gridCol w:w="2645"/>
+        <w:gridCol w:w="3279"/>
+      </w:tblGrid>
+      <w:tr>
+        <w:trPr>
+          <w:jc w:val="center"/>
+        </w:trPr>
+        <w:tc>
+          <w:tcPr>
+            <w:tcW w:w="0" w:type="auto"/>
+            <w:hideMark/>
+          </w:tcPr>
+          <w:p>
+            <w:pPr>
+              <w:spacing w:after="160" w:line="360" w:lineRule="auto"/>
+              <w:jc w:val="both"/>
+              <w:rPr>
+                <w:rFonts w:ascii="Arial" w:hAnsi="Arial" w:cs="Arial"/>
+              </w:rPr>
+            </w:pPr>
+            <w:r>
+              <w:rPr>
+                <w:rFonts w:ascii="Arial" w:hAnsi="Arial" w:cs="Arial"/>
+                <w:b/>
+                <w:bCs/>
+              </w:rPr>
+              <w:t>Campo (Columna)</w:t>
+            </w:r>
+          </w:p>
+        </w:tc>
+        <w:tc>
+          <w:tcPr>
+            <w:tcW w:w="0" w:type="auto"/>
+            <w:hideMark/>
+          </w:tcPr>
+          <w:p>
+            <w:pPr>
+              <w:spacing w:after="160" w:line="360" w:lineRule="auto"/>
+              <w:jc w:val="both"/>
+              <w:rPr>
+                <w:rFonts w:ascii="Arial" w:hAnsi="Arial" w:cs="Arial"/>
+              </w:rPr>
+            </w:pPr>
+            <w:r>
+              <w:rPr>
+                <w:rFonts w:ascii="Arial" w:hAnsi="Arial" w:cs="Arial"/>
+                <w:b/>
+                <w:bCs/>
+              </w:rPr>
+              <w:t>Tipo de Dato (PostgreSQL)</w:t>
+            </w:r>
+          </w:p>
+        </w:tc>
+      </w:tr>
+      <w:tr>
+        <w:trPr>
+          <w:jc w:val="center"/>
+        </w:trPr>
+        <w:tc>
+          <w:tcPr>
+            <w:tcW w:w="0" w:type="auto"/>
+            <w:hideMark/>
+          </w:tcPr>
+          <w:p>
+            <w:pPr>
+              <w:spacing w:after="160" w:line="360" w:lineRule="auto"/>
+              <w:jc w:val="both"/>
+              <w:rPr>
+                <w:rFonts w:ascii="Arial" w:hAnsi="Arial" w:cs="Arial"/>
+              </w:rPr>
+            </w:pPr>
+            <w:proofErr w:type="spellStart"/>
+            <w:r>
+              <w:rPr>
+                <w:rFonts w:ascii="Arial" w:hAnsi="Arial" w:cs="Arial"/>
+              </w:rPr>
+              <w:t>folio_aspirante</w:t>
+            </w:r>
+            <w:proofErr w:type="spellEnd"/>
+          </w:p>
+        </w:tc>
+        <w:tc>
+          <w:tcPr>
+            <w:tcW w:w="0" w:type="auto"/>
+            <w:hideMark/>
+          </w:tcPr>
+          <w:p>
+            <w:pPr>
+              <w:spacing w:after="160" w:line="360" w:lineRule="auto"/>
+              <w:jc w:val="both"/>
+              <w:rPr>
+                <w:rFonts w:ascii="Arial" w:hAnsi="Arial" w:cs="Arial"/>
+              </w:rPr>
+            </w:pPr>
+            <w:proofErr w:type="gramStart"/>
+            <w:r>
+              <w:rPr>
+                <w:rFonts w:ascii="Arial" w:hAnsi="Arial" w:cs="Arial"/>
+              </w:rPr>
+              <w:t>VARCHAR(</w:t>
+            </w:r>
+            <w:proofErr w:type="gramEnd"/>
+            <w:r>
+              <w:rPr>
+                <w:rFonts w:ascii="Arial" w:hAnsi="Arial" w:cs="Arial"/>
+              </w:rPr>
+              <w:t>20)</w:t>
+            </w:r>
+          </w:p>
+        </w:tc>
+      </w:tr>
+      <w:tr>
+        <w:trPr>
+          <w:jc w:val="center"/>
+        </w:trPr>
+        <w:tc>
+          <w:tcPr>
+            <w:tcW w:w="0" w:type="auto"/>
+            <w:hideMark/>
+          </w:tcPr>
+          <w:p>
+            <w:pPr>
+              <w:spacing w:after="160" w:line="360" w:lineRule="auto"/>
+              <w:jc w:val="both"/>
+              <w:rPr>
+                <w:rFonts w:ascii="Arial" w:hAnsi="Arial" w:cs="Arial"/>
+              </w:rPr>
+            </w:pPr>
+            <w:r>
+              <w:rPr>
+                <w:rFonts w:ascii="Arial" w:hAnsi="Arial" w:cs="Arial"/>
+              </w:rPr>
+              <w:t>nombres</w:t>
+            </w:r>
+          </w:p>
+        </w:tc>
+        <w:tc>
+          <w:tcPr>
+            <w:tcW w:w="0" w:type="auto"/>
+            <w:hideMark/>
+          </w:tcPr>
+          <w:p>
+            <w:pPr>
+              <w:spacing w:after="160" w:line="360" w:lineRule="auto"/>
+              <w:jc w:val="both"/>
+              <w:rPr>
+                <w:rFonts w:ascii="Arial" w:hAnsi="Arial" w:cs="Arial"/>
+              </w:rPr>
+            </w:pPr>
+            <w:proofErr w:type="gramStart"/>
+            <w:r>
+              <w:rPr>
+                <w:rFonts w:ascii="Arial" w:hAnsi="Arial" w:cs="Arial"/>
+              </w:rPr>
+              <w:t>VARCHAR(</w:t>
+            </w:r>
+            <w:proofErr w:type="gramEnd"/>
+            <w:r>
+              <w:rPr>
+                <w:rFonts w:ascii="Arial" w:hAnsi="Arial" w:cs="Arial"/>
+              </w:rPr>
+              <w:t>60)</w:t>
+            </w:r>
+          </w:p>
+        </w:tc>
+      </w:tr>
+      <w:tr>
+        <w:trPr>
+          <w:jc w:val="center"/>
+        </w:trPr>
+        <w:tc>
+          <w:tcPr>
+            <w:tcW w:w="0" w:type="auto"/>
+            <w:hideMark/>
+          </w:tcPr>
+          <w:p>
+            <w:pPr>
+              <w:spacing w:after="160" w:line="360" w:lineRule="auto"/>
+              <w:jc w:val="both"/>
+              <w:rPr>
+                <w:rFonts w:ascii="Arial" w:hAnsi="Arial" w:cs="Arial"/>
+              </w:rPr>
+            </w:pPr>
+            <w:proofErr w:type="spellStart"/>
+            <w:r>
+              <w:rPr>
+                <w:rFonts w:ascii="Arial" w:hAnsi="Arial" w:cs="Arial"/>
+              </w:rPr>
+              <w:t>apellido_paterno</w:t>
+            </w:r>
+            <w:proofErr w:type="spellEnd"/>
+          </w:p>
+        </w:tc>
+        <w:tc>
+          <w:tcPr>
+            <w:tcW w:w="0" w:type="auto"/>
+            <w:hideMark/>
+          </w:tcPr>
+          <w:p>
+            <w:pPr>
+              <w:spacing w:after="160" w:line="360" w:lineRule="auto"/>
+              <w:jc w:val="both"/>
+              <w:rPr>
+                <w:rFonts w:ascii="Arial" w:hAnsi="Arial" w:cs="Arial"/>
+              </w:rPr>
+            </w:pPr>
+            <w:proofErr w:type="gramStart"/>
+            <w:r>
+              <w:rPr>
+                <w:rFonts w:ascii="Arial" w:hAnsi="Arial" w:cs="Arial"/>
+              </w:rPr>
+              <w:t>VARCHAR(</w:t>
+            </w:r>
+            <w:proofErr w:type="gramEnd"/>
+            <w:r>
+              <w:rPr>
+                <w:rFonts w:ascii="Arial" w:hAnsi="Arial" w:cs="Arial"/>
+              </w:rPr>
+              <w:t>50)</w:t>
+            </w:r>
+          </w:p>
+        </w:tc>
+      </w:tr>
+      <w:tr>
+        <w:trPr>
+          <w:jc w:val="center"/>
+        </w:trPr>
+        <w:tc>
+          <w:tcPr>
+            <w:tcW w:w="0" w:type="auto"/>
+            <w:hideMark/>
+          </w:tcPr>
+          <w:p>
+            <w:pPr>
+              <w:spacing w:after="160" w:line="360" w:lineRule="auto"/>
+              <w:jc w:val="both"/>
+              <w:rPr>
+                <w:rFonts w:ascii="Arial" w:hAnsi="Arial" w:cs="Arial"/>
+              </w:rPr>
+            </w:pPr>
+            <w:proofErr w:type="spellStart"/>
+            <w:r>
+              <w:rPr>
+                <w:rFonts w:ascii="Arial" w:hAnsi="Arial" w:cs="Arial"/>
+              </w:rPr>
+              <w:t>apellido_materno</w:t>
+            </w:r>
+            <w:proofErr w:type="spellEnd"/>
+          </w:p>
+        </w:tc>
+        <w:tc>
+          <w:tcPr>
+            <w:tcW w:w="0" w:type="auto"/>
+            <w:hideMark/>
+          </w:tcPr>
+          <w:p>
+            <w:pPr>
+              <w:spacing w:after="160" w:line="360" w:lineRule="auto"/>
+              <w:jc w:val="both"/>
+              <w:rPr>
+                <w:rFonts w:ascii="Arial" w:hAnsi="Arial" w:cs="Arial"/>
+              </w:rPr>
+            </w:pPr>
+            <w:proofErr w:type="gramStart"/>
+            <w:r>
+              <w:rPr>
+                <w:rFonts w:ascii="Arial" w:hAnsi="Arial" w:cs="Arial"/>
+              </w:rPr>
+              <w:t>VARCHAR(</w:t>
+            </w:r>
+            <w:proofErr w:type="gramEnd"/>
+            <w:r>
+              <w:rPr>
+                <w:rFonts w:ascii="Arial" w:hAnsi="Arial" w:cs="Arial"/>
+              </w:rPr>
+              <w:t>50)</w:t>
+            </w:r>
+          </w:p>
+        </w:tc>
+      </w:tr>
+      <w:tr>
+        <w:trPr>
+          <w:jc w:val="center"/>
+        </w:trPr>
+        <w:tc>
+          <w:tcPr>
+            <w:tcW w:w="0" w:type="auto"/>
+            <w:hideMark/>
+          </w:tcPr>
+          <w:p>
+            <w:pPr>
+              <w:spacing w:after="160" w:line="360" w:lineRule="auto"/>
+              <w:jc w:val="both"/>
+              <w:rPr>
+                <w:rFonts w:ascii="Arial" w:hAnsi="Arial" w:cs="Arial"/>
+              </w:rPr>
+            </w:pPr>
+            <w:proofErr w:type="spellStart"/>
+            <w:r>
+              <w:rPr>
+                <w:rFonts w:ascii="Arial" w:hAnsi="Arial" w:cs="Arial"/>
+              </w:rPr>
+              <w:t>curp</w:t>
+            </w:r>
+            <w:proofErr w:type="spellEnd"/>
+          </w:p>
+        </w:tc>
+        <w:tc>
+          <w:tcPr>
+            <w:tcW w:w="0" w:type="auto"/>
+            <w:hideMark/>
+          </w:tcPr>
+          <w:p>
+            <w:pPr>
+              <w:spacing w:after="160" w:line="360" w:lineRule="auto"/>
+              <w:jc w:val="both"/>
+              <w:rPr>
+                <w:rFonts w:ascii="Arial" w:hAnsi="Arial" w:cs="Arial"/>
+              </w:rPr>
+            </w:pPr>
+            <w:proofErr w:type="gramStart"/>
+            <w:r>
+              <w:rPr>
+                <w:rFonts w:ascii="Arial" w:hAnsi="Arial" w:cs="Arial"/>
+              </w:rPr>
+              <w:t>VARCHAR(</w:t>
+            </w:r>
+            <w:proofErr w:type="gramEnd"/>
+            <w:r>
+              <w:rPr>
+                <w:rFonts w:ascii="Arial" w:hAnsi="Arial" w:cs="Arial"/>
+              </w:rPr>
+              <w:t>18)</w:t>
+            </w:r>
+          </w:p>
+        </w:tc>
+      </w:tr>
+      <w:tr>
+        <w:trPr>
+          <w:jc w:val="center"/>
+        </w:trPr>
+        <w:tc>
+          <w:tcPr>
+            <w:tcW w:w="0" w:type="auto"/>
+            <w:hideMark/>
+          </w:tcPr>
+          <w:p>
+            <w:pPr>
+              <w:spacing w:after="160" w:line="360" w:lineRule="auto"/>
+              <w:jc w:val="both"/>
+              <w:rPr>
+                <w:rFonts w:ascii="Arial" w:hAnsi="Arial" w:cs="Arial"/>
+              </w:rPr>
+            </w:pPr>
+            <w:proofErr w:type="spellStart"/>
+            <w:r>
+              <w:rPr>
+                <w:rFonts w:ascii="Arial" w:hAnsi="Arial" w:cs="Arial"/>
+              </w:rPr>
+              <w:t>fecha_nacimiento</w:t>
+            </w:r>
+            <w:proofErr w:type="spellEnd"/>
+          </w:p>
+        </w:tc>
+        <w:tc>
+          <w:tcPr>
+            <w:tcW w:w="0" w:type="auto"/>
+            <w:hideMark/>
+          </w:tcPr>
+          <w:p>
+            <w:pPr>
+              <w:spacing w:after="160" w:line="360" w:lineRule="auto"/>
+              <w:jc w:val="both"/>
+              <w:rPr>
+                <w:rFonts w:ascii="Arial" w:hAnsi="Arial" w:cs="Arial"/>
+              </w:rPr>
+            </w:pPr>
+            <w:r>
+              <w:rPr>
+                <w:rFonts w:ascii="Arial" w:hAnsi="Arial" w:cs="Arial"/>
+              </w:rPr>
+              <w:t>DATE</w:t>
+            </w:r>
+          </w:p>
+        </w:tc>
+      </w:tr>
+      <w:tr>
+        <w:trPr>
+          <w:jc w:val="center"/>
+        </w:trPr>
+        <w:tc>
+          <w:tcPr>
+            <w:tcW w:w="0" w:type="auto"/>
+            <w:hideMark/>
+          </w:tcPr>
+          <w:p>
+            <w:pPr>
+              <w:spacing w:after="160" w:line="360" w:lineRule="auto"/>
+              <w:jc w:val="both"/>
+              <w:rPr>
+                <w:rFonts w:ascii="Arial" w:hAnsi="Arial" w:cs="Arial"/>
+              </w:rPr>
+            </w:pPr>
+            <w:proofErr w:type="spellStart"/>
+            <w:r>
+              <w:rPr>
+                <w:rFonts w:ascii="Arial" w:hAnsi="Arial" w:cs="Arial"/>
+              </w:rPr>
+              <w:t>correo_personal</w:t>
+            </w:r>
+            <w:proofErr w:type="spellEnd"/>
+          </w:p>
+        </w:tc>
+        <w:tc>
+          <w:tcPr>
+            <w:tcW w:w="0" w:type="auto"/>
+            <w:hideMark/>
+          </w:tcPr>
+          <w:p>
+            <w:pPr>
+              <w:spacing w:after="160" w:line="360" w:lineRule="auto"/>
+              <w:jc w:val="both"/>
+              <w:rPr>
+                <w:rFonts w:ascii="Arial" w:hAnsi="Arial" w:cs="Arial"/>
+              </w:rPr>
+            </w:pPr>
+            <w:proofErr w:type="gramStart"/>
+            <w:r>
+              <w:rPr>
+                <w:rFonts w:ascii="Arial" w:hAnsi="Arial" w:cs="Arial"/>
+              </w:rPr>
+              <w:t>VARCHAR(</w:t>
+            </w:r>
+            <w:proofErr w:type="gramEnd"/>
+            <w:r>
+              <w:rPr>
+                <w:rFonts w:ascii="Arial" w:hAnsi="Arial" w:cs="Arial"/>
+              </w:rPr>
+              <w:t>100)</w:t>
+            </w:r>
+          </w:p>
+        </w:tc>
+      </w:tr>
+      <w:tr>
+        <w:trPr>
+          <w:jc w:val="center"/>
+        </w:trPr>
+        <w:tc>
+          <w:tcPr>
+            <w:tcW w:w="0" w:type="auto"/>
+            <w:hideMark/>
+          </w:tcPr>
+          <w:p>
+            <w:pPr>
+              <w:spacing w:after="160" w:line="360" w:lineRule="auto"/>
+              <w:jc w:val="both"/>
+              <w:rPr>
+                <w:rFonts w:ascii="Arial" w:hAnsi="Arial" w:cs="Arial"/>
+              </w:rPr>
+            </w:pPr>
+            <w:proofErr w:type="spellStart"/>
+            <w:r>
+              <w:rPr>
+                <w:rFonts w:ascii="Arial" w:hAnsi="Arial" w:cs="Arial"/>
+              </w:rPr>
+              <w:t>telefono</w:t>
+            </w:r>
+            <w:proofErr w:type="spellEnd"/>
+          </w:p>
+        </w:tc>
+        <w:tc>
+          <w:tcPr>
+            <w:tcW w:w="0" w:type="auto"/>
+            <w:hideMark/>
+          </w:tcPr>
+          <w:p>
+            <w:pPr>
+              <w:spacing w:after="160" w:line="360" w:lineRule="auto"/>
+              <w:jc w:val="both"/>
+              <w:rPr>
+                <w:rFonts w:ascii="Arial" w:hAnsi="Arial" w:cs="Arial"/>
+              </w:rPr>
+            </w:pPr>
+            <w:proofErr w:type="gramStart"/>
+            <w:r>
+              <w:rPr>
+                <w:rFonts w:ascii="Arial" w:hAnsi="Arial" w:cs="Arial"/>
+              </w:rPr>
+              <w:t>VARCHAR(</w:t>
+            </w:r>
+            <w:proofErr w:type="gramEnd"/>
+            <w:r>
+              <w:rPr>
+                <w:rFonts w:ascii="Arial" w:hAnsi="Arial" w:cs="Arial"/>
+              </w:rPr>
+              <w:t>20)</w:t>
+            </w:r>
+          </w:p>
+        </w:tc>
+      </w:tr>
+      <w:tr>
+        <w:trPr>
+          <w:jc w:val="center"/>
+        </w:trPr>
+        <w:tc>
+          <w:tcPr>
+            <w:tcW w:w="0" w:type="auto"/>
+            <w:hideMark/>
+          </w:tcPr>
+          <w:p>
+            <w:pPr>
+              <w:spacing w:after="160" w:line="360" w:lineRule="auto"/>
+              <w:jc w:val="both"/>
+              <w:rPr>
+                <w:rFonts w:ascii="Arial" w:hAnsi="Arial" w:cs="Arial"/>
+              </w:rPr>
+            </w:pPr>
+            <w:proofErr w:type="spellStart"/>
+            <w:r>
+              <w:rPr>
+                <w:rFonts w:ascii="Arial" w:hAnsi="Arial" w:cs="Arial"/>
+              </w:rPr>
+              <w:t>carrera_solicitada</w:t>
+            </w:r>
+            <w:proofErr w:type="spellEnd"/>
+          </w:p>
+        </w:tc>
+        <w:tc>
+          <w:tcPr>
+            <w:tcW w:w="0" w:type="auto"/>
+            <w:hideMark/>
+          </w:tcPr>
+          <w:p>
+            <w:pPr>
+              <w:spacing w:after="160" w:line="360" w:lineRule="auto"/>
+              <w:jc w:val="both"/>
+              <w:rPr>
+                <w:rFonts w:ascii="Arial" w:hAnsi="Arial" w:cs="Arial"/>
+              </w:rPr>
+            </w:pPr>
+            <w:proofErr w:type="gramStart"/>
+            <w:r>
+              <w:rPr>
+                <w:rFonts w:ascii="Arial" w:hAnsi="Arial" w:cs="Arial"/>
+              </w:rPr>
+              <w:t>VARCHAR(</w:t>
+            </w:r>
+            <w:proofErr w:type="gramEnd"/>
+            <w:r>
+              <w:rPr>
+                <w:rFonts w:ascii="Arial" w:hAnsi="Arial" w:cs="Arial"/>
+              </w:rPr>
+              <w:t>100)</w:t>
+            </w:r>
+          </w:p>
+        </w:tc>
+      </w:tr>
+      <w:tr>
+        <w:trPr>
+          <w:jc w:val="center"/>
+        </w:trPr>
+        <w:tc>
+          <w:tcPr>
+            <w:tcW w:w="0" w:type="auto"/>
+            <w:hideMark/>
+          </w:tcPr>
+          <w:p>
+            <w:pPr>
+              <w:spacing w:after="160" w:line="360" w:lineRule="auto"/>
+              <w:jc w:val="both"/>
+              <w:rPr>
+                <w:rFonts w:ascii="Arial" w:hAnsi="Arial" w:cs="Arial"/>
+              </w:rPr>
+            </w:pPr>
+            <w:proofErr w:type="spellStart"/>
+            <w:r>
+              <w:rPr>
+                <w:rFonts w:ascii="Arial" w:hAnsi="Arial" w:cs="Arial"/>
+              </w:rPr>
+              <w:t>promedio_preparatoria</w:t>
+            </w:r>
+            <w:proofErr w:type="spellEnd"/>
+          </w:p>
+        </w:tc>
+        <w:tc>
+          <w:tcPr>
+            <w:tcW w:w="0" w:type="auto"/>
+            <w:hideMark/>
+          </w:tcPr>
+          <w:p>
+            <w:pPr>
+              <w:spacing w:after="160" w:line="360" w:lineRule="auto"/>
+              <w:jc w:val="both"/>
+              <w:rPr>
+                <w:rFonts w:ascii="Arial" w:hAnsi="Arial" w:cs="Arial"/>
+              </w:rPr>
+            </w:pPr>
+            <w:proofErr w:type="gramStart"/>
+            <w:r>
+              <w:rPr>
+                <w:rFonts w:ascii="Arial" w:hAnsi="Arial" w:cs="Arial"/>
+              </w:rPr>
+              <w:t>NUMERIC(</w:t>
+            </w:r>
+            <w:proofErr w:type="gramEnd"/>
+            <w:r>
+              <w:rPr>
+                <w:rFonts w:ascii="Arial" w:hAnsi="Arial" w:cs="Arial"/>
+              </w:rPr>
+              <w:t>4,2)</w:t>
+            </w:r>
+          </w:p>
+        </w:tc>
+      </w:tr>
+      <w:tr>
+        <w:trPr>
+          <w:jc w:val="center"/>
+        </w:trPr>
+        <w:tc>
+          <w:tcPr>
+            <w:tcW w:w="0" w:type="auto"/>
+            <w:hideMark/>
+          </w:tcPr>
+          <w:p>
+            <w:pPr>
+              <w:spacing w:after="160" w:line="360" w:lineRule="auto"/>
+              <w:jc w:val="both"/>
+              <w:rPr>
+                <w:rFonts w:ascii="Arial" w:hAnsi="Arial" w:cs="Arial"/>
+              </w:rPr>
+            </w:pPr>
+            <w:proofErr w:type="spellStart"/>
+            <w:r>
+              <w:rPr>
+                <w:rFonts w:ascii="Arial" w:hAnsi="Arial" w:cs="Arial"/>
+              </w:rPr>
+              <w:t>estatus_admision</w:t>
+            </w:r>
+            <w:proofErr w:type="spellEnd"/>
+          </w:p>
+        </w:tc>
+        <w:tc>
+          <w:tcPr>
+            <w:tcW w:w="0" w:type="auto"/>
+            <w:hideMark/>
+          </w:tcPr>
+          <w:p>
+            <w:pPr>
+              <w:spacing w:after="160" w:line="360" w:lineRule="auto"/>
+              <w:jc w:val="both"/>
+              <w:rPr>
+                <w:rFonts w:ascii="Arial" w:hAnsi="Arial" w:cs="Arial"/>
+              </w:rPr>
+            </w:pPr>
+            <w:proofErr w:type="gramStart"/>
+            <w:r>
+              <w:rPr>
+                <w:rFonts w:ascii="Arial" w:hAnsi="Arial" w:cs="Arial"/>
+              </w:rPr>
+              <w:t>VARCHAR(</w:t>
+            </w:r>
+            <w:proofErr w:type="gramEnd"/>
+            <w:r>
+              <w:rPr>
+                <w:rFonts w:ascii="Arial" w:hAnsi="Arial" w:cs="Arial"/>
+              </w:rPr>
+              <w:t>30)</w:t>
+            </w:r>
+          </w:p>
+        </w:tc>
+      </w:tr>
+      <w:tr>
+        <w:trPr>
+          <w:jc w:val="center"/>
+        </w:trPr>
+        <w:tc>
+          <w:tcPr>
+            <w:tcW w:w="0" w:type="auto"/>
+            <w:hideMark/>
+          </w:tcPr>
+          <w:p>
+            <w:pPr>
+              <w:spacing w:after="160" w:line="360" w:lineRule="auto"/>
+              <w:jc w:val="both"/>
+              <w:rPr>
+                <w:rFonts w:ascii="Arial" w:hAnsi="Arial" w:cs="Arial"/>
+              </w:rPr>
+            </w:pPr>
+            <w:proofErr w:type="spellStart"/>
+            <w:r>
+              <w:rPr>
+                <w:rFonts w:ascii="Arial" w:hAnsi="Arial" w:cs="Arial"/>
+              </w:rPr>
+              <w:t>fecha_registro</w:t>
+            </w:r>
+            <w:proofErr w:type="spellEnd"/>
+          </w:p>
+        </w:tc>
+        <w:tc>
+          <w:tcPr>
+            <w:tcW w:w="0" w:type="auto"/>
+            <w:hideMark/>
+          </w:tcPr>
+          <w:p>
+            <w:pPr>
+              <w:spacing w:after="160" w:line="360" w:lineRule="auto"/>
+              <w:jc w:val="both"/>
+              <w:rPr>
+                <w:rFonts w:ascii="Arial" w:hAnsi="Arial" w:cs="Arial"/>
+              </w:rPr>
+            </w:pPr>
+            <w:r>
+              <w:rPr>
+                <w:rFonts w:ascii="Arial" w:hAnsi="Arial" w:cs="Arial"/>
+              </w:rPr>
+              <w:t>DATE</w:t>
+            </w:r>
+          </w:p>
+        </w:tc>
+      </w:tr>
+    </w:tbl>
+    <w:p>
+      <w:pPr>
+        <w:spacing w:line="360" w:lineRule="auto"/>
+        <w:jc w:val="both"/>
+        <w:rPr>
+          <w:rFonts w:ascii="Arial" w:hAnsi="Arial" w:cs="Arial"/>
+        </w:rPr>
+      </w:pPr>
+    </w:p>
+    <w:p>
+      <w:pPr>
+        <w:spacing w:line="360" w:lineRule="auto"/>
+        <w:jc w:val="both"/>
+        <w:rPr>
+          <w:rFonts w:ascii="Arial" w:hAnsi="Arial" w:cs="Arial"/>
+        </w:rPr>
+      </w:pPr>
+      <w:r>
+        <w:rPr>
+          <w:rFonts w:ascii="Arial" w:hAnsi="Arial" w:cs="Arial"/>
+        </w:rPr>
+        <w:t>La clave primaria (</w:t>
+      </w:r>
+      <w:proofErr w:type="spellStart"/>
+      <w:r>
+        <w:rPr>
+          <w:rFonts w:ascii="Arial" w:hAnsi="Arial" w:cs="Arial"/>
+        </w:rPr>
+        <w:t>folio_aspirante</w:t>
+      </w:r>
+      <w:proofErr w:type="spellEnd"/>
+      <w:r>
+        <w:rPr>
+          <w:rFonts w:ascii="Arial" w:hAnsi="Arial" w:cs="Arial"/>
+        </w:rPr>
+        <w:t xml:space="preserve">) se define como VARCHAR previendo que las fichas de admisión puedan contener letras, números o guiones. Se utilizan tipos estándar como VARCHAR para nombres, apellidos, CURP y datos de contacto. </w:t>
+      </w:r>
+    </w:p>
+    <w:p>
+      <w:pPr>
+        <w:spacing w:line="360" w:lineRule="auto"/>
+        <w:jc w:val="both"/>
+        <w:rPr>
+          <w:rFonts w:ascii="Arial" w:hAnsi="Arial" w:cs="Arial"/>
+        </w:rPr>
+      </w:pPr>
+      <w:r>
+        <w:rPr>
+          <w:rFonts w:ascii="Arial" w:hAnsi="Arial" w:cs="Arial"/>
+        </w:rPr>
+        <w:t xml:space="preserve">El promedio del nivel educativo anterior (bachillerato/preparatoria) utiliza </w:t>
+      </w:r>
+      <w:proofErr w:type="gramStart"/>
+      <w:r>
+        <w:rPr>
+          <w:rFonts w:ascii="Arial" w:hAnsi="Arial" w:cs="Arial"/>
+        </w:rPr>
+        <w:t>NUMERIC(</w:t>
+      </w:r>
+      <w:proofErr w:type="gramEnd"/>
+      <w:r>
+        <w:rPr>
+          <w:rFonts w:ascii="Arial" w:hAnsi="Arial" w:cs="Arial"/>
+        </w:rPr>
+        <w:t xml:space="preserve">4,2) para precisión decimal. El </w:t>
+      </w:r>
+      <w:proofErr w:type="spellStart"/>
+      <w:r>
+        <w:rPr>
+          <w:rFonts w:ascii="Arial" w:hAnsi="Arial" w:cs="Arial"/>
+        </w:rPr>
+        <w:t>estatus_admision</w:t>
+      </w:r>
+      <w:proofErr w:type="spellEnd"/>
+      <w:r>
+        <w:rPr>
+          <w:rFonts w:ascii="Arial" w:hAnsi="Arial" w:cs="Arial"/>
+        </w:rPr>
+        <w:t xml:space="preserve"> es un texto corto (VARCHAR) que indicará estados como 'En proceso', 'Aceptado' o 'Rechazado'. La fecha de registro utiliza DATE.</w:t>
+      </w:r>
     </w:p>
     <w:sectPr>
       <w:pgSz w:w="12240" w:h="15840"/>
@@ -7138,7 +7980,6 @@
   <w:style w:type="character" w:default="1" w:styleId="Fuentedeprrafopredeter">
     <w:name w:val="Default Paragraph Font"/>
     <w:uiPriority w:val="1"/>
-    <w:semiHidden/>
     <w:unhideWhenUsed/>
   </w:style>
   <w:style w:type="table" w:default="1" w:styleId="Tablanormal">
@@ -7451,6 +8292,25 @@
       <w:color w:val="0F4761" w:themeColor="accent1" w:themeShade="BF"/>
       <w:spacing w:val="5"/>
     </w:rPr>
+  </w:style>
+  <w:style w:type="table" w:styleId="Tablaconcuadrcula">
+    <w:name w:val="Table Grid"/>
+    <w:basedOn w:val="Tablanormal"/>
+    <w:uiPriority w:val="39"/>
+    <w:rsid w:val="008127A5"/>
+    <w:pPr>
+      <w:spacing w:after="0" w:line="240" w:lineRule="auto"/>
+    </w:pPr>
+    <w:tblPr>
+      <w:tblBorders>
+        <w:top w:val="single" w:sz="4" w:space="0" w:color="auto"/>
+        <w:left w:val="single" w:sz="4" w:space="0" w:color="auto"/>
+        <w:bottom w:val="single" w:sz="4" w:space="0" w:color="auto"/>
+        <w:right w:val="single" w:sz="4" w:space="0" w:color="auto"/>
+        <w:insideH w:val="single" w:sz="4" w:space="0" w:color="auto"/>
+        <w:insideV w:val="single" w:sz="4" w:space="0" w:color="auto"/>
+      </w:tblBorders>
+    </w:tblPr>
   </w:style>
 </w:styles>
 </file>

</xml_diff>